<commit_message>
Refactor chat bubbles; silence NPC respawn logs
Extract DrawChatBubbles into a helper in RenderManager.cpp and replace the inline lambda with calls to reduce duplication. Cap interpolation dt using std::min, and ensure chat messages expire after 4s while drawing speech bubbles. In Server/main.cpp, comment out debug respawn logs and the automatic NPC respawn chat broadcast. Clean up .idea/workspace.xml change-list entries and adjust a workItem duration. Also include an updated .docx binary (content change).
</commit_message>
<xml_diff>
--- a/텀프로젝트/텀프로젝트 추가 기획서.docx
+++ b/텀프로젝트/텀프로젝트 추가 기획서.docx
@@ -96,7 +96,22 @@
           <w:b/>
           <w:bCs/>
         </w:rPr>
-        <w:t xml:space="preserve">, 지형장애물, </w:t>
+        <w:t xml:space="preserve">, </w:t>
+      </w:r>
+      <w:r>
+        <w:rPr>
+          <w:b/>
+          <w:bCs/>
+          <w:strike/>
+        </w:rPr>
+        <w:t>지형장애물</w:t>
+      </w:r>
+      <w:r>
+        <w:rPr>
+          <w:b/>
+          <w:bCs/>
+        </w:rPr>
+        <w:t xml:space="preserve">, </w:t>
       </w:r>
       <w:r>
         <w:rPr>
@@ -1184,28 +1199,65 @@
         <w:rPr>
           <w:b/>
           <w:bCs/>
+          <w:strike/>
         </w:rPr>
         <w:t>즉시 소모 아이템</w:t>
       </w:r>
       <w:r>
+        <w:rPr>
+          <w:strike/>
+        </w:rPr>
         <w:t xml:space="preserve">: </w:t>
       </w:r>
       <w:proofErr w:type="spellStart"/>
       <w:r>
+        <w:rPr>
+          <w:strike/>
+        </w:rPr>
         <w:t>퀵슬롯</w:t>
       </w:r>
       <w:proofErr w:type="spellEnd"/>
       <w:r>
+        <w:rPr>
+          <w:strike/>
+        </w:rPr>
         <w:t xml:space="preserve">(1번)을 통해 즉시 체력을 회복하는 </w:t>
       </w:r>
       <w:proofErr w:type="spellStart"/>
       <w:r>
+        <w:rPr>
+          <w:strike/>
+        </w:rPr>
         <w:t>포션</w:t>
       </w:r>
       <w:proofErr w:type="spellEnd"/>
       <w:r>
+        <w:rPr>
+          <w:strike/>
+        </w:rPr>
         <w:t xml:space="preserve"> 아이템을 구현합니다. </w:t>
       </w:r>
+      <w:r>
+        <w:rPr>
+          <w:rFonts w:hint="eastAsia"/>
+          <w:strike/>
+        </w:rPr>
+        <w:t>-&gt;</w:t>
+      </w:r>
+      <w:r>
+        <w:rPr>
+          <w:rFonts w:hint="eastAsia"/>
+        </w:rPr>
+        <w:t xml:space="preserve"> 아직은 스킬이고 실제 아이템과 </w:t>
+      </w:r>
+      <w:proofErr w:type="spellStart"/>
+      <w:r>
+        <w:rPr>
+          <w:rFonts w:hint="eastAsia"/>
+        </w:rPr>
+        <w:t>연동해야함</w:t>
+      </w:r>
+      <w:proofErr w:type="spellEnd"/>
     </w:p>
     <w:p>
       <w:pPr>
@@ -1251,48 +1303,73 @@
         <w:rPr>
           <w:b/>
           <w:bCs/>
+          <w:strike/>
         </w:rPr>
         <w:t>버프 및 범위 공격</w:t>
       </w:r>
       <w:r>
+        <w:rPr>
+          <w:strike/>
+        </w:rPr>
         <w:t xml:space="preserve">: 2번 단축키로 일정 시간 공격력을 높여주는 '힘 </w:t>
       </w:r>
       <w:proofErr w:type="spellStart"/>
       <w:r>
+        <w:rPr>
+          <w:strike/>
+        </w:rPr>
         <w:t>포션</w:t>
       </w:r>
       <w:proofErr w:type="spellEnd"/>
       <w:r>
+        <w:rPr>
+          <w:strike/>
+        </w:rPr>
         <w:t>(버프 스킬</w:t>
       </w:r>
       <w:r>
         <w:rPr>
           <w:rFonts w:hint="eastAsia"/>
+          <w:strike/>
         </w:rPr>
         <w:t xml:space="preserve"> </w:t>
       </w:r>
       <w:r>
         <w:rPr>
           <w:rFonts w:hint="eastAsia"/>
+          <w:strike/>
         </w:rPr>
         <w:t>=</w:t>
       </w:r>
       <w:r>
         <w:rPr>
           <w:rFonts w:hint="eastAsia"/>
+          <w:strike/>
         </w:rPr>
         <w:t xml:space="preserve"> 1level -&gt; 2level</w:t>
       </w:r>
       <w:r>
+        <w:rPr>
+          <w:strike/>
+        </w:rPr>
         <w:t xml:space="preserve">)'을 사용하며, 무기 강화 단계에 따라 기본 공격이 </w:t>
       </w:r>
       <w:proofErr w:type="spellStart"/>
       <w:r>
+        <w:rPr>
+          <w:strike/>
+        </w:rPr>
         <w:t>다방향</w:t>
       </w:r>
       <w:proofErr w:type="spellEnd"/>
       <w:r>
-        <w:t xml:space="preserve"> 범위 공격으로 진화합니다. </w:t>
+        <w:rPr>
+          <w:strike/>
+        </w:rPr>
+        <w:t xml:space="preserve"> 범위 공격으로 진화합니다</w:t>
+      </w:r>
+      <w:r>
+        <w:t xml:space="preserve">. </w:t>
       </w:r>
     </w:p>
     <w:p>

</xml_diff>